<commit_message>
Enhance enterprise review perspective
</commit_message>
<xml_diff>
--- a/提交材料/00_报名表填写文本.docx
+++ b/提交材料/00_报名表填写文本.docx
@@ -442,6 +442,71 @@
           </w:p>
         </w:tc>
       </w:tr>
+      <w:tr>
+        <w:tc>
+          <w:tcPr>
+            <w:tcW w:type="dxa" w:w="2160"/>
+            <w:vAlign w:val="center"/>
+            <w:tcMar>
+              <w:top w:w="80" w:type="dxa"/>
+              <w:start w:w="120" w:type="dxa"/>
+              <w:bottom w:w="80" w:type="dxa"/>
+              <w:end w:w="120" w:type="dxa"/>
+            </w:tcMar>
+          </w:tcPr>
+          <w:p>
+            <w:r>
+              <w:rPr>
+                <w:rFonts w:ascii="Calibri" w:hAnsi="Calibri" w:eastAsia="Microsoft YaHei"/>
+                <w:sz w:val="19"/>
+              </w:rPr>
+              <w:t>企业评审优化清单</w:t>
+            </w:r>
+          </w:p>
+        </w:tc>
+        <w:tc>
+          <w:tcPr>
+            <w:tcW w:type="dxa" w:w="3888"/>
+            <w:vAlign w:val="center"/>
+            <w:tcMar>
+              <w:top w:w="80" w:type="dxa"/>
+              <w:start w:w="120" w:type="dxa"/>
+              <w:bottom w:w="80" w:type="dxa"/>
+              <w:end w:w="120" w:type="dxa"/>
+            </w:tcMar>
+          </w:tcPr>
+          <w:p>
+            <w:r>
+              <w:rPr>
+                <w:rFonts w:ascii="Calibri" w:hAnsi="Calibri" w:eastAsia="Microsoft YaHei"/>
+                <w:sz w:val="19"/>
+              </w:rPr>
+              <w:t>站在评审视角回答安全、收益、责任、数据、推广和创新辨识度</w:t>
+            </w:r>
+          </w:p>
+        </w:tc>
+        <w:tc>
+          <w:tcPr>
+            <w:tcW w:type="dxa" w:w="3168"/>
+            <w:vAlign w:val="center"/>
+            <w:tcMar>
+              <w:top w:w="80" w:type="dxa"/>
+              <w:start w:w="120" w:type="dxa"/>
+              <w:bottom w:w="80" w:type="dxa"/>
+              <w:end w:w="120" w:type="dxa"/>
+            </w:tcMar>
+          </w:tcPr>
+          <w:p>
+            <w:r>
+              <w:rPr>
+                <w:rFonts w:ascii="Calibri" w:hAnsi="Calibri" w:eastAsia="Microsoft YaHei"/>
+                <w:sz w:val="19"/>
+              </w:rPr>
+              <w:t>05_企业评审视角优化清单.docx</w:t>
+            </w:r>
+          </w:p>
+        </w:tc>
+      </w:tr>
     </w:tbl>
     <w:p>
       <w:pPr>

</xml_diff>